<commit_message>
Documentación: agrega F-14, tira LED de velocidad en el alerón
Co-Authored-By: Claude Sonnet 4.6 <noreply@anthropic.com>
</commit_message>
<xml_diff>
--- a/Documentación/DOC - CARRITO DOCUMENTO.docx
+++ b/Documentación/DOC - CARRITO DOCUMENTO.docx
@@ -49,12 +49,6 @@
         <w:gridCol w:w="5764"/>
       </w:tblGrid>
       <w:tr>
-        <w:tblPrEx>
-          <w:tblCellMar>
-            <w:top w:w="0" w:type="dxa"/>
-            <w:bottom w:w="0" w:type="dxa"/>
-          </w:tblCellMar>
-        </w:tblPrEx>
         <w:tc>
           <w:tcPr>
             <w:tcW w:w="5764" w:type="dxa"/>
@@ -255,12 +249,6 @@
         <w:gridCol w:w="2994"/>
       </w:tblGrid>
       <w:tr>
-        <w:tblPrEx>
-          <w:tblCellMar>
-            <w:top w:w="0" w:type="dxa"/>
-            <w:bottom w:w="0" w:type="dxa"/>
-          </w:tblCellMar>
-        </w:tblPrEx>
         <w:tc>
           <w:tcPr>
             <w:tcW w:w="2125" w:type="dxa"/>
@@ -427,15 +415,7 @@
         <w:ind w:left="360"/>
       </w:pPr>
       <w:r>
-        <w:t xml:space="preserve">Está basado y es conforme con el estándar IEEE </w:t>
-      </w:r>
-      <w:proofErr w:type="spellStart"/>
-      <w:r>
-        <w:t>Std</w:t>
-      </w:r>
-      <w:proofErr w:type="spellEnd"/>
-      <w:r>
-        <w:t xml:space="preserve"> 830-1998.</w:t>
+        <w:t>Está basado y es conforme con el estándar IEEE Std 830-1998.</w:t>
       </w:r>
     </w:p>
     <w:p>
@@ -750,15 +730,7 @@
         <w:pStyle w:val="Textoindependiente"/>
       </w:pPr>
       <w:r>
-        <w:t xml:space="preserve">De la plantilla de formato del documento © &amp; </w:t>
-      </w:r>
-      <w:proofErr w:type="spellStart"/>
-      <w:r>
-        <w:t>Coloriuris</w:t>
-      </w:r>
-      <w:proofErr w:type="spellEnd"/>
-      <w:r>
-        <w:t xml:space="preserve"> http://www.qualitatis.org</w:t>
+        <w:t>De la plantilla de formato del documento © &amp; Coloriuris http://www.qualitatis.org</w:t>
       </w:r>
     </w:p>
     <w:p>
@@ -1459,21 +1431,7 @@
               <w:rPr>
                 <w:rFonts w:cs="Arial"/>
               </w:rPr>
-              <w:t xml:space="preserve">Fdo. D./ </w:t>
-            </w:r>
-            <w:proofErr w:type="spellStart"/>
-            <w:r>
-              <w:rPr>
-                <w:rFonts w:cs="Arial"/>
-              </w:rPr>
-              <w:t>Dña</w:t>
-            </w:r>
-            <w:proofErr w:type="spellEnd"/>
-            <w:r>
-              <w:rPr>
-                <w:rFonts w:cs="Arial"/>
-              </w:rPr>
-              <w:t xml:space="preserve"> </w:t>
+              <w:t xml:space="preserve">Fdo. D./ Dña </w:t>
             </w:r>
             <w:r>
               <w:fldChar w:fldCharType="begin"/>
@@ -1514,21 +1472,7 @@
               <w:rPr>
                 <w:rFonts w:cs="Arial"/>
               </w:rPr>
-              <w:t>Fdo. D./</w:t>
-            </w:r>
-            <w:proofErr w:type="spellStart"/>
-            <w:r>
-              <w:rPr>
-                <w:rFonts w:cs="Arial"/>
-              </w:rPr>
-              <w:t>Dña</w:t>
-            </w:r>
-            <w:proofErr w:type="spellEnd"/>
-            <w:r>
-              <w:rPr>
-                <w:rFonts w:cs="Arial"/>
-              </w:rPr>
-              <w:t xml:space="preserve"> </w:t>
+              <w:t xml:space="preserve">Fdo. D./Dña </w:t>
             </w:r>
             <w:r>
               <w:fldChar w:fldCharType="begin"/>
@@ -1686,6 +1630,7 @@
         <w:r>
           <w:rPr>
             <w:noProof/>
+            <w:webHidden/>
           </w:rPr>
         </w:r>
         <w:r>
@@ -1759,6 +1704,7 @@
         <w:r>
           <w:rPr>
             <w:noProof/>
+            <w:webHidden/>
           </w:rPr>
         </w:r>
         <w:r>
@@ -1852,6 +1798,7 @@
         <w:r>
           <w:rPr>
             <w:noProof/>
+            <w:webHidden/>
           </w:rPr>
         </w:r>
         <w:r>
@@ -1941,6 +1888,7 @@
         <w:r>
           <w:rPr>
             <w:noProof/>
+            <w:webHidden/>
           </w:rPr>
         </w:r>
         <w:r>
@@ -2030,6 +1978,7 @@
         <w:r>
           <w:rPr>
             <w:noProof/>
+            <w:webHidden/>
           </w:rPr>
         </w:r>
         <w:r>
@@ -2119,6 +2068,7 @@
         <w:r>
           <w:rPr>
             <w:noProof/>
+            <w:webHidden/>
           </w:rPr>
         </w:r>
         <w:r>
@@ -2208,6 +2158,7 @@
         <w:r>
           <w:rPr>
             <w:noProof/>
+            <w:webHidden/>
           </w:rPr>
         </w:r>
         <w:r>
@@ -2297,6 +2248,7 @@
         <w:r>
           <w:rPr>
             <w:noProof/>
+            <w:webHidden/>
           </w:rPr>
         </w:r>
         <w:r>
@@ -2386,6 +2338,7 @@
         <w:r>
           <w:rPr>
             <w:noProof/>
+            <w:webHidden/>
           </w:rPr>
         </w:r>
         <w:r>
@@ -2479,6 +2432,7 @@
         <w:r>
           <w:rPr>
             <w:noProof/>
+            <w:webHidden/>
           </w:rPr>
         </w:r>
         <w:r>
@@ -2568,6 +2522,7 @@
         <w:r>
           <w:rPr>
             <w:noProof/>
+            <w:webHidden/>
           </w:rPr>
         </w:r>
         <w:r>
@@ -2657,6 +2612,7 @@
         <w:r>
           <w:rPr>
             <w:noProof/>
+            <w:webHidden/>
           </w:rPr>
         </w:r>
         <w:r>
@@ -2746,6 +2702,7 @@
         <w:r>
           <w:rPr>
             <w:noProof/>
+            <w:webHidden/>
           </w:rPr>
         </w:r>
         <w:r>
@@ -2835,6 +2792,7 @@
         <w:r>
           <w:rPr>
             <w:noProof/>
+            <w:webHidden/>
           </w:rPr>
         </w:r>
         <w:r>
@@ -2924,6 +2882,7 @@
         <w:r>
           <w:rPr>
             <w:noProof/>
+            <w:webHidden/>
           </w:rPr>
         </w:r>
         <w:r>
@@ -3013,6 +2972,7 @@
         <w:r>
           <w:rPr>
             <w:noProof/>
+            <w:webHidden/>
           </w:rPr>
         </w:r>
         <w:r>
@@ -3106,6 +3066,7 @@
         <w:r>
           <w:rPr>
             <w:noProof/>
+            <w:webHidden/>
           </w:rPr>
         </w:r>
         <w:r>
@@ -3195,6 +3156,7 @@
         <w:r>
           <w:rPr>
             <w:noProof/>
+            <w:webHidden/>
           </w:rPr>
         </w:r>
         <w:r>
@@ -3280,6 +3242,7 @@
         <w:r>
           <w:rPr>
             <w:noProof/>
+            <w:webHidden/>
           </w:rPr>
         </w:r>
         <w:r>
@@ -3365,6 +3328,7 @@
         <w:r>
           <w:rPr>
             <w:noProof/>
+            <w:webHidden/>
           </w:rPr>
         </w:r>
         <w:r>
@@ -3452,6 +3416,7 @@
         <w:r>
           <w:rPr>
             <w:noProof/>
+            <w:webHidden/>
           </w:rPr>
         </w:r>
         <w:r>
@@ -3537,6 +3502,7 @@
         <w:r>
           <w:rPr>
             <w:noProof/>
+            <w:webHidden/>
           </w:rPr>
         </w:r>
         <w:r>
@@ -3626,6 +3592,7 @@
         <w:r>
           <w:rPr>
             <w:noProof/>
+            <w:webHidden/>
           </w:rPr>
         </w:r>
         <w:r>
@@ -3711,6 +3678,7 @@
         <w:r>
           <w:rPr>
             <w:noProof/>
+            <w:webHidden/>
           </w:rPr>
         </w:r>
         <w:r>
@@ -3796,6 +3764,7 @@
         <w:r>
           <w:rPr>
             <w:noProof/>
+            <w:webHidden/>
           </w:rPr>
         </w:r>
         <w:r>
@@ -3881,6 +3850,7 @@
         <w:r>
           <w:rPr>
             <w:noProof/>
+            <w:webHidden/>
           </w:rPr>
         </w:r>
         <w:r>
@@ -3966,6 +3936,7 @@
         <w:r>
           <w:rPr>
             <w:noProof/>
+            <w:webHidden/>
           </w:rPr>
         </w:r>
         <w:r>
@@ -4055,6 +4026,7 @@
         <w:r>
           <w:rPr>
             <w:noProof/>
+            <w:webHidden/>
           </w:rPr>
         </w:r>
         <w:r>
@@ -4140,6 +4112,7 @@
         <w:r>
           <w:rPr>
             <w:noProof/>
+            <w:webHidden/>
           </w:rPr>
         </w:r>
         <w:r>
@@ -4225,6 +4198,7 @@
         <w:r>
           <w:rPr>
             <w:noProof/>
+            <w:webHidden/>
           </w:rPr>
         </w:r>
         <w:r>
@@ -4310,6 +4284,7 @@
         <w:r>
           <w:rPr>
             <w:noProof/>
+            <w:webHidden/>
           </w:rPr>
         </w:r>
         <w:r>
@@ -4395,6 +4370,7 @@
         <w:r>
           <w:rPr>
             <w:noProof/>
+            <w:webHidden/>
           </w:rPr>
         </w:r>
         <w:r>
@@ -4480,6 +4456,7 @@
         <w:r>
           <w:rPr>
             <w:noProof/>
+            <w:webHidden/>
           </w:rPr>
         </w:r>
         <w:r>
@@ -4565,6 +4542,7 @@
         <w:r>
           <w:rPr>
             <w:noProof/>
+            <w:webHidden/>
           </w:rPr>
         </w:r>
         <w:r>
@@ -4654,6 +4632,7 @@
         <w:r>
           <w:rPr>
             <w:noProof/>
+            <w:webHidden/>
           </w:rPr>
         </w:r>
         <w:r>
@@ -4747,6 +4726,7 @@
         <w:r>
           <w:rPr>
             <w:noProof/>
+            <w:webHidden/>
           </w:rPr>
         </w:r>
         <w:r>
@@ -4979,12 +4959,6 @@
         <w:gridCol w:w="5444"/>
       </w:tblGrid>
       <w:tr>
-        <w:tblPrEx>
-          <w:tblCellMar>
-            <w:top w:w="0" w:type="dxa"/>
-            <w:bottom w:w="0" w:type="dxa"/>
-          </w:tblCellMar>
-        </w:tblPrEx>
         <w:tc>
           <w:tcPr>
             <w:tcW w:w="2357" w:type="dxa"/>
@@ -5049,12 +5023,6 @@
         </w:tc>
       </w:tr>
       <w:tr>
-        <w:tblPrEx>
-          <w:tblCellMar>
-            <w:top w:w="0" w:type="dxa"/>
-            <w:bottom w:w="0" w:type="dxa"/>
-          </w:tblCellMar>
-        </w:tblPrEx>
         <w:tc>
           <w:tcPr>
             <w:tcW w:w="2357" w:type="dxa"/>
@@ -5125,12 +5093,6 @@
         </w:tc>
       </w:tr>
       <w:tr>
-        <w:tblPrEx>
-          <w:tblCellMar>
-            <w:top w:w="0" w:type="dxa"/>
-            <w:bottom w:w="0" w:type="dxa"/>
-          </w:tblCellMar>
-        </w:tblPrEx>
         <w:tc>
           <w:tcPr>
             <w:tcW w:w="2357" w:type="dxa"/>
@@ -5201,12 +5163,6 @@
         </w:tc>
       </w:tr>
       <w:tr>
-        <w:tblPrEx>
-          <w:tblCellMar>
-            <w:top w:w="0" w:type="dxa"/>
-            <w:bottom w:w="0" w:type="dxa"/>
-          </w:tblCellMar>
-        </w:tblPrEx>
         <w:tc>
           <w:tcPr>
             <w:tcW w:w="2357" w:type="dxa"/>
@@ -5277,12 +5233,6 @@
         </w:tc>
       </w:tr>
       <w:tr>
-        <w:tblPrEx>
-          <w:tblCellMar>
-            <w:top w:w="0" w:type="dxa"/>
-            <w:bottom w:w="0" w:type="dxa"/>
-          </w:tblCellMar>
-        </w:tblPrEx>
         <w:tc>
           <w:tcPr>
             <w:tcW w:w="2357" w:type="dxa"/>
@@ -5353,12 +5303,6 @@
         </w:tc>
       </w:tr>
       <w:tr>
-        <w:tblPrEx>
-          <w:tblCellMar>
-            <w:top w:w="0" w:type="dxa"/>
-            <w:bottom w:w="0" w:type="dxa"/>
-          </w:tblCellMar>
-        </w:tblPrEx>
         <w:tc>
           <w:tcPr>
             <w:tcW w:w="2357" w:type="dxa"/>
@@ -5464,12 +5408,6 @@
         <w:gridCol w:w="5444"/>
       </w:tblGrid>
       <w:tr>
-        <w:tblPrEx>
-          <w:tblCellMar>
-            <w:top w:w="0" w:type="dxa"/>
-            <w:bottom w:w="0" w:type="dxa"/>
-          </w:tblCellMar>
-        </w:tblPrEx>
         <w:tc>
           <w:tcPr>
             <w:tcW w:w="2357" w:type="dxa"/>
@@ -5534,12 +5472,6 @@
         </w:tc>
       </w:tr>
       <w:tr>
-        <w:tblPrEx>
-          <w:tblCellMar>
-            <w:top w:w="0" w:type="dxa"/>
-            <w:bottom w:w="0" w:type="dxa"/>
-          </w:tblCellMar>
-        </w:tblPrEx>
         <w:tc>
           <w:tcPr>
             <w:tcW w:w="2357" w:type="dxa"/>
@@ -5610,12 +5542,6 @@
         </w:tc>
       </w:tr>
       <w:tr>
-        <w:tblPrEx>
-          <w:tblCellMar>
-            <w:top w:w="0" w:type="dxa"/>
-            <w:bottom w:w="0" w:type="dxa"/>
-          </w:tblCellMar>
-        </w:tblPrEx>
         <w:tc>
           <w:tcPr>
             <w:tcW w:w="2357" w:type="dxa"/>
@@ -5686,12 +5612,6 @@
         </w:tc>
       </w:tr>
       <w:tr>
-        <w:tblPrEx>
-          <w:tblCellMar>
-            <w:top w:w="0" w:type="dxa"/>
-            <w:bottom w:w="0" w:type="dxa"/>
-          </w:tblCellMar>
-        </w:tblPrEx>
         <w:tc>
           <w:tcPr>
             <w:tcW w:w="2357" w:type="dxa"/>
@@ -5762,12 +5682,6 @@
         </w:tc>
       </w:tr>
       <w:tr>
-        <w:tblPrEx>
-          <w:tblCellMar>
-            <w:top w:w="0" w:type="dxa"/>
-            <w:bottom w:w="0" w:type="dxa"/>
-          </w:tblCellMar>
-        </w:tblPrEx>
         <w:tc>
           <w:tcPr>
             <w:tcW w:w="2357" w:type="dxa"/>
@@ -5838,12 +5752,6 @@
         </w:tc>
       </w:tr>
       <w:tr>
-        <w:tblPrEx>
-          <w:tblCellMar>
-            <w:top w:w="0" w:type="dxa"/>
-            <w:bottom w:w="0" w:type="dxa"/>
-          </w:tblCellMar>
-        </w:tblPrEx>
         <w:tc>
           <w:tcPr>
             <w:tcW w:w="2357" w:type="dxa"/>
@@ -5948,12 +5856,6 @@
         <w:gridCol w:w="5444"/>
       </w:tblGrid>
       <w:tr>
-        <w:tblPrEx>
-          <w:tblCellMar>
-            <w:top w:w="0" w:type="dxa"/>
-            <w:bottom w:w="0" w:type="dxa"/>
-          </w:tblCellMar>
-        </w:tblPrEx>
         <w:tc>
           <w:tcPr>
             <w:tcW w:w="2357" w:type="dxa"/>
@@ -6014,12 +5916,6 @@
         </w:tc>
       </w:tr>
       <w:tr>
-        <w:tblPrEx>
-          <w:tblCellMar>
-            <w:top w:w="0" w:type="dxa"/>
-            <w:bottom w:w="0" w:type="dxa"/>
-          </w:tblCellMar>
-        </w:tblPrEx>
         <w:tc>
           <w:tcPr>
             <w:tcW w:w="2357" w:type="dxa"/>
@@ -6077,12 +5973,6 @@
         </w:tc>
       </w:tr>
       <w:tr>
-        <w:tblPrEx>
-          <w:tblCellMar>
-            <w:top w:w="0" w:type="dxa"/>
-            <w:bottom w:w="0" w:type="dxa"/>
-          </w:tblCellMar>
-        </w:tblPrEx>
         <w:tc>
           <w:tcPr>
             <w:tcW w:w="2357" w:type="dxa"/>
@@ -6152,12 +6042,6 @@
         </w:tc>
       </w:tr>
       <w:tr>
-        <w:tblPrEx>
-          <w:tblCellMar>
-            <w:top w:w="0" w:type="dxa"/>
-            <w:bottom w:w="0" w:type="dxa"/>
-          </w:tblCellMar>
-        </w:tblPrEx>
         <w:tc>
           <w:tcPr>
             <w:tcW w:w="2357" w:type="dxa"/>
@@ -6227,12 +6111,6 @@
         </w:tc>
       </w:tr>
       <w:tr>
-        <w:tblPrEx>
-          <w:tblCellMar>
-            <w:top w:w="0" w:type="dxa"/>
-            <w:bottom w:w="0" w:type="dxa"/>
-          </w:tblCellMar>
-        </w:tblPrEx>
         <w:tc>
           <w:tcPr>
             <w:tcW w:w="2357" w:type="dxa"/>
@@ -6302,12 +6180,6 @@
         </w:tc>
       </w:tr>
       <w:tr>
-        <w:tblPrEx>
-          <w:tblCellMar>
-            <w:top w:w="0" w:type="dxa"/>
-            <w:bottom w:w="0" w:type="dxa"/>
-          </w:tblCellMar>
-        </w:tblPrEx>
         <w:tc>
           <w:tcPr>
             <w:tcW w:w="2357" w:type="dxa"/>
@@ -6412,12 +6284,6 @@
         <w:gridCol w:w="5444"/>
       </w:tblGrid>
       <w:tr>
-        <w:tblPrEx>
-          <w:tblCellMar>
-            <w:top w:w="0" w:type="dxa"/>
-            <w:bottom w:w="0" w:type="dxa"/>
-          </w:tblCellMar>
-        </w:tblPrEx>
         <w:tc>
           <w:tcPr>
             <w:tcW w:w="2357" w:type="dxa"/>
@@ -6475,12 +6341,6 @@
         </w:tc>
       </w:tr>
       <w:tr>
-        <w:tblPrEx>
-          <w:tblCellMar>
-            <w:top w:w="0" w:type="dxa"/>
-            <w:bottom w:w="0" w:type="dxa"/>
-          </w:tblCellMar>
-        </w:tblPrEx>
         <w:tc>
           <w:tcPr>
             <w:tcW w:w="2357" w:type="dxa"/>
@@ -6551,12 +6411,6 @@
         </w:tc>
       </w:tr>
       <w:tr>
-        <w:tblPrEx>
-          <w:tblCellMar>
-            <w:top w:w="0" w:type="dxa"/>
-            <w:bottom w:w="0" w:type="dxa"/>
-          </w:tblCellMar>
-        </w:tblPrEx>
         <w:tc>
           <w:tcPr>
             <w:tcW w:w="2357" w:type="dxa"/>
@@ -6627,12 +6481,6 @@
         </w:tc>
       </w:tr>
       <w:tr>
-        <w:tblPrEx>
-          <w:tblCellMar>
-            <w:top w:w="0" w:type="dxa"/>
-            <w:bottom w:w="0" w:type="dxa"/>
-          </w:tblCellMar>
-        </w:tblPrEx>
         <w:tc>
           <w:tcPr>
             <w:tcW w:w="2357" w:type="dxa"/>
@@ -6703,12 +6551,6 @@
         </w:tc>
       </w:tr>
       <w:tr>
-        <w:tblPrEx>
-          <w:tblCellMar>
-            <w:top w:w="0" w:type="dxa"/>
-            <w:bottom w:w="0" w:type="dxa"/>
-          </w:tblCellMar>
-        </w:tblPrEx>
         <w:tc>
           <w:tcPr>
             <w:tcW w:w="2357" w:type="dxa"/>
@@ -6779,12 +6621,6 @@
         </w:tc>
       </w:tr>
       <w:tr>
-        <w:tblPrEx>
-          <w:tblCellMar>
-            <w:top w:w="0" w:type="dxa"/>
-            <w:bottom w:w="0" w:type="dxa"/>
-          </w:tblCellMar>
-        </w:tblPrEx>
         <w:tc>
           <w:tcPr>
             <w:tcW w:w="2357" w:type="dxa"/>
@@ -6914,12 +6750,6 @@
         <w:gridCol w:w="5444"/>
       </w:tblGrid>
       <w:tr>
-        <w:tblPrEx>
-          <w:tblCellMar>
-            <w:top w:w="0" w:type="dxa"/>
-            <w:bottom w:w="0" w:type="dxa"/>
-          </w:tblCellMar>
-        </w:tblPrEx>
         <w:tc>
           <w:tcPr>
             <w:tcW w:w="2357" w:type="dxa"/>
@@ -6977,12 +6807,6 @@
         </w:tc>
       </w:tr>
       <w:tr>
-        <w:tblPrEx>
-          <w:tblCellMar>
-            <w:top w:w="0" w:type="dxa"/>
-            <w:bottom w:w="0" w:type="dxa"/>
-          </w:tblCellMar>
-        </w:tblPrEx>
         <w:tc>
           <w:tcPr>
             <w:tcW w:w="2357" w:type="dxa"/>
@@ -7053,12 +6877,6 @@
         </w:tc>
       </w:tr>
       <w:tr>
-        <w:tblPrEx>
-          <w:tblCellMar>
-            <w:top w:w="0" w:type="dxa"/>
-            <w:bottom w:w="0" w:type="dxa"/>
-          </w:tblCellMar>
-        </w:tblPrEx>
         <w:tc>
           <w:tcPr>
             <w:tcW w:w="2357" w:type="dxa"/>
@@ -7129,12 +6947,6 @@
         </w:tc>
       </w:tr>
       <w:tr>
-        <w:tblPrEx>
-          <w:tblCellMar>
-            <w:top w:w="0" w:type="dxa"/>
-            <w:bottom w:w="0" w:type="dxa"/>
-          </w:tblCellMar>
-        </w:tblPrEx>
         <w:tc>
           <w:tcPr>
             <w:tcW w:w="2357" w:type="dxa"/>
@@ -7205,12 +7017,6 @@
         </w:tc>
       </w:tr>
       <w:tr>
-        <w:tblPrEx>
-          <w:tblCellMar>
-            <w:top w:w="0" w:type="dxa"/>
-            <w:bottom w:w="0" w:type="dxa"/>
-          </w:tblCellMar>
-        </w:tblPrEx>
         <w:tc>
           <w:tcPr>
             <w:tcW w:w="2357" w:type="dxa"/>
@@ -7278,12 +7084,6 @@
         </w:tc>
       </w:tr>
       <w:tr>
-        <w:tblPrEx>
-          <w:tblCellMar>
-            <w:top w:w="0" w:type="dxa"/>
-            <w:bottom w:w="0" w:type="dxa"/>
-          </w:tblCellMar>
-        </w:tblPrEx>
         <w:tc>
           <w:tcPr>
             <w:tcW w:w="2357" w:type="dxa"/>
@@ -7351,12 +7151,6 @@
         </w:tc>
       </w:tr>
       <w:tr>
-        <w:tblPrEx>
-          <w:tblCellMar>
-            <w:top w:w="0" w:type="dxa"/>
-            <w:bottom w:w="0" w:type="dxa"/>
-          </w:tblCellMar>
-        </w:tblPrEx>
         <w:tc>
           <w:tcPr>
             <w:tcW w:w="2357" w:type="dxa"/>
@@ -7459,12 +7253,6 @@
         <w:gridCol w:w="5444"/>
       </w:tblGrid>
       <w:tr>
-        <w:tblPrEx>
-          <w:tblCellMar>
-            <w:top w:w="0" w:type="dxa"/>
-            <w:bottom w:w="0" w:type="dxa"/>
-          </w:tblCellMar>
-        </w:tblPrEx>
         <w:tc>
           <w:tcPr>
             <w:tcW w:w="2357" w:type="dxa"/>
@@ -7518,24 +7306,13 @@
                 <w:u w:val="single"/>
               </w:rPr>
             </w:pPr>
-            <w:proofErr w:type="spellStart"/>
-            <w:r>
-              <w:t>Yisbel</w:t>
-            </w:r>
-            <w:proofErr w:type="spellEnd"/>
-            <w:r>
-              <w:t xml:space="preserve"> Diaz Brito</w:t>
+            <w:r>
+              <w:t>Yisbel Diaz Brito</w:t>
             </w:r>
           </w:p>
         </w:tc>
       </w:tr>
       <w:tr>
-        <w:tblPrEx>
-          <w:tblCellMar>
-            <w:top w:w="0" w:type="dxa"/>
-            <w:bottom w:w="0" w:type="dxa"/>
-          </w:tblCellMar>
-        </w:tblPrEx>
         <w:tc>
           <w:tcPr>
             <w:tcW w:w="2357" w:type="dxa"/>
@@ -7606,12 +7383,6 @@
         </w:tc>
       </w:tr>
       <w:tr>
-        <w:tblPrEx>
-          <w:tblCellMar>
-            <w:top w:w="0" w:type="dxa"/>
-            <w:bottom w:w="0" w:type="dxa"/>
-          </w:tblCellMar>
-        </w:tblPrEx>
         <w:tc>
           <w:tcPr>
             <w:tcW w:w="2357" w:type="dxa"/>
@@ -7682,12 +7453,6 @@
         </w:tc>
       </w:tr>
       <w:tr>
-        <w:tblPrEx>
-          <w:tblCellMar>
-            <w:top w:w="0" w:type="dxa"/>
-            <w:bottom w:w="0" w:type="dxa"/>
-          </w:tblCellMar>
-        </w:tblPrEx>
         <w:tc>
           <w:tcPr>
             <w:tcW w:w="2357" w:type="dxa"/>
@@ -7758,12 +7523,6 @@
         </w:tc>
       </w:tr>
       <w:tr>
-        <w:tblPrEx>
-          <w:tblCellMar>
-            <w:top w:w="0" w:type="dxa"/>
-            <w:bottom w:w="0" w:type="dxa"/>
-          </w:tblCellMar>
-        </w:tblPrEx>
         <w:tc>
           <w:tcPr>
             <w:tcW w:w="2357" w:type="dxa"/>
@@ -7834,12 +7593,6 @@
         </w:tc>
       </w:tr>
       <w:tr>
-        <w:tblPrEx>
-          <w:tblCellMar>
-            <w:top w:w="0" w:type="dxa"/>
-            <w:bottom w:w="0" w:type="dxa"/>
-          </w:tblCellMar>
-        </w:tblPrEx>
         <w:tc>
           <w:tcPr>
             <w:tcW w:w="2357" w:type="dxa"/>
@@ -7951,12 +7704,6 @@
         <w:gridCol w:w="5444"/>
       </w:tblGrid>
       <w:tr>
-        <w:tblPrEx>
-          <w:tblCellMar>
-            <w:top w:w="0" w:type="dxa"/>
-            <w:bottom w:w="0" w:type="dxa"/>
-          </w:tblCellMar>
-        </w:tblPrEx>
         <w:tc>
           <w:tcPr>
             <w:tcW w:w="2357" w:type="dxa"/>
@@ -8007,24 +7754,13 @@
               <w:pStyle w:val="Normalindentado2"/>
               <w:ind w:left="0"/>
             </w:pPr>
-            <w:proofErr w:type="spellStart"/>
-            <w:r>
-              <w:t>Josue</w:t>
-            </w:r>
-            <w:proofErr w:type="spellEnd"/>
-            <w:r>
-              <w:t xml:space="preserve"> Herrera</w:t>
+            <w:r>
+              <w:t>Josue Herrera</w:t>
             </w:r>
           </w:p>
         </w:tc>
       </w:tr>
       <w:tr>
-        <w:tblPrEx>
-          <w:tblCellMar>
-            <w:top w:w="0" w:type="dxa"/>
-            <w:bottom w:w="0" w:type="dxa"/>
-          </w:tblCellMar>
-        </w:tblPrEx>
         <w:tc>
           <w:tcPr>
             <w:tcW w:w="2357" w:type="dxa"/>
@@ -8095,12 +7831,6 @@
         </w:tc>
       </w:tr>
       <w:tr>
-        <w:tblPrEx>
-          <w:tblCellMar>
-            <w:top w:w="0" w:type="dxa"/>
-            <w:bottom w:w="0" w:type="dxa"/>
-          </w:tblCellMar>
-        </w:tblPrEx>
         <w:tc>
           <w:tcPr>
             <w:tcW w:w="2357" w:type="dxa"/>
@@ -8171,12 +7901,6 @@
         </w:tc>
       </w:tr>
       <w:tr>
-        <w:tblPrEx>
-          <w:tblCellMar>
-            <w:top w:w="0" w:type="dxa"/>
-            <w:bottom w:w="0" w:type="dxa"/>
-          </w:tblCellMar>
-        </w:tblPrEx>
         <w:tc>
           <w:tcPr>
             <w:tcW w:w="2357" w:type="dxa"/>
@@ -8247,12 +7971,6 @@
         </w:tc>
       </w:tr>
       <w:tr>
-        <w:tblPrEx>
-          <w:tblCellMar>
-            <w:top w:w="0" w:type="dxa"/>
-            <w:bottom w:w="0" w:type="dxa"/>
-          </w:tblCellMar>
-        </w:tblPrEx>
         <w:tc>
           <w:tcPr>
             <w:tcW w:w="2357" w:type="dxa"/>
@@ -8323,12 +8041,6 @@
         </w:tc>
       </w:tr>
       <w:tr>
-        <w:tblPrEx>
-          <w:tblCellMar>
-            <w:top w:w="0" w:type="dxa"/>
-            <w:bottom w:w="0" w:type="dxa"/>
-          </w:tblCellMar>
-        </w:tblPrEx>
         <w:tc>
           <w:tcPr>
             <w:tcW w:w="2357" w:type="dxa"/>
@@ -8505,12 +8217,6 @@
         <w:gridCol w:w="1538"/>
       </w:tblGrid>
       <w:tr>
-        <w:tblPrEx>
-          <w:tblCellMar>
-            <w:top w:w="0" w:type="dxa"/>
-            <w:bottom w:w="0" w:type="dxa"/>
-          </w:tblCellMar>
-        </w:tblPrEx>
         <w:trPr>
           <w:cantSplit/>
           <w:trHeight w:val="284"/>
@@ -8683,12 +8389,6 @@
         </w:tc>
       </w:tr>
       <w:tr>
-        <w:tblPrEx>
-          <w:tblCellMar>
-            <w:top w:w="0" w:type="dxa"/>
-            <w:bottom w:w="0" w:type="dxa"/>
-          </w:tblCellMar>
-        </w:tblPrEx>
         <w:trPr>
           <w:cantSplit/>
         </w:trPr>
@@ -8872,12 +8572,6 @@
         </w:tc>
       </w:tr>
       <w:tr>
-        <w:tblPrEx>
-          <w:tblCellMar>
-            <w:top w:w="0" w:type="dxa"/>
-            <w:bottom w:w="0" w:type="dxa"/>
-          </w:tblCellMar>
-        </w:tblPrEx>
         <w:trPr>
           <w:cantSplit/>
         </w:trPr>
@@ -9205,10 +8899,13 @@
           <w:sz w:val="22"/>
           <w:szCs w:val="22"/>
         </w:rPr>
-        <w:t xml:space="preserve">l equipo del proyecto desarrolla el diseño mecánico del Carrito en </w:t>
-      </w:r>
-      <w:proofErr w:type="spellStart"/>
-      <w:r>
+        <w:t>l equipo del proyecto desarrolla el diseño mecánico del Carrito en FreeCAD y el diseño de la placa de circuito impreso (PCB) de su sistema electrónico. [TBD: resto del alcance del desarrollo].</w:t>
+      </w:r>
+    </w:p>
+    <w:p>
+      <w:pPr>
+        <w:pStyle w:val="guiazul"/>
+        <w:ind w:left="600"/>
         <w:rPr>
           <w:rFonts w:ascii="Georgia" w:hAnsi="Georgia"/>
           <w:i w:val="0"/>
@@ -9216,10 +8913,12 @@
           <w:sz w:val="22"/>
           <w:szCs w:val="22"/>
         </w:rPr>
-        <w:t>FreeCAD</w:t>
-      </w:r>
-      <w:proofErr w:type="spellEnd"/>
-      <w:r>
+      </w:pPr>
+    </w:p>
+    <w:p>
+      <w:pPr>
+        <w:pStyle w:val="guiazul"/>
+        <w:ind w:left="600"/>
         <w:rPr>
           <w:rFonts w:ascii="Georgia" w:hAnsi="Georgia"/>
           <w:i w:val="0"/>
@@ -9227,13 +8926,8 @@
           <w:sz w:val="22"/>
           <w:szCs w:val="22"/>
         </w:rPr>
-        <w:t xml:space="preserve"> y el diseño de la placa de circuito impreso (PCB) de su sistema electrónico. [TBD: resto del alcance del desarrollo].</w:t>
-      </w:r>
-    </w:p>
-    <w:p>
-      <w:pPr>
-        <w:pStyle w:val="guiazul"/>
-        <w:ind w:left="600"/>
+      </w:pPr>
+      <w:r>
         <w:rPr>
           <w:rFonts w:ascii="Georgia" w:hAnsi="Georgia"/>
           <w:i w:val="0"/>
@@ -9241,12 +8935,9 @@
           <w:sz w:val="22"/>
           <w:szCs w:val="22"/>
         </w:rPr>
-      </w:pPr>
-    </w:p>
-    <w:p>
-      <w:pPr>
-        <w:pStyle w:val="guiazul"/>
-        <w:ind w:left="600"/>
+        <w:t xml:space="preserve">Se seleccionó FreeCAD por ser un modelador CAD </w:t>
+      </w:r>
+      <w:r>
         <w:rPr>
           <w:rFonts w:ascii="Georgia" w:hAnsi="Georgia"/>
           <w:i w:val="0"/>
@@ -9254,7 +8945,8 @@
           <w:sz w:val="22"/>
           <w:szCs w:val="22"/>
         </w:rPr>
-      </w:pPr>
+        <w:t>3</w:t>
+      </w:r>
       <w:r>
         <w:rPr>
           <w:rFonts w:ascii="Georgia" w:hAnsi="Georgia"/>
@@ -9263,9 +8955,8 @@
           <w:sz w:val="22"/>
           <w:szCs w:val="22"/>
         </w:rPr>
-        <w:t xml:space="preserve">Se seleccionó </w:t>
-      </w:r>
-      <w:proofErr w:type="spellStart"/>
+        <w:t>D paramétrico, libre y de código abierto, distribuido bajo la licencia GNU LGPL 2.1, que permite su uso sin costo en entornos académicos y comerciales (FreeCAD, s. f.). La alternativa considerada, SOLIDWORKS Student Edition, se licencia exclusivamente para uso educativo y no comercial, tiene una vigencia de 12 meses, identifica los archivos y planos generados como pertenecientes a la edición estudiantil y no garantiza que dichos archivos puedan abrirse en las versiones comerciales del software (Dassault Systèmes SolidWorks Corporation, s. f.). Estas condiciones limitarían una eventual comercialización del diseño del Carrito.</w:t>
+      </w:r>
       <w:r>
         <w:rPr>
           <w:rFonts w:ascii="Georgia" w:hAnsi="Georgia"/>
@@ -9274,10 +8965,13 @@
           <w:sz w:val="22"/>
           <w:szCs w:val="22"/>
         </w:rPr>
-        <w:t>FreeCAD</w:t>
-      </w:r>
-      <w:proofErr w:type="spellEnd"/>
-      <w:r>
+        <w:t>y el diseño de la placa de circuito impreso (PCB) de su sistema electrónico.</w:t>
+      </w:r>
+    </w:p>
+    <w:p>
+      <w:pPr>
+        <w:pStyle w:val="guiazul"/>
+        <w:ind w:left="600"/>
         <w:rPr>
           <w:rFonts w:ascii="Georgia" w:hAnsi="Georgia"/>
           <w:i w:val="0"/>
@@ -9285,9 +8979,12 @@
           <w:sz w:val="22"/>
           <w:szCs w:val="22"/>
         </w:rPr>
-        <w:t xml:space="preserve"> por ser un modelador CAD </w:t>
-      </w:r>
-      <w:r>
+      </w:pPr>
+    </w:p>
+    <w:p>
+      <w:pPr>
+        <w:pStyle w:val="guiazul"/>
+        <w:ind w:left="600"/>
         <w:rPr>
           <w:rFonts w:ascii="Georgia" w:hAnsi="Georgia"/>
           <w:i w:val="0"/>
@@ -9295,8 +8992,7 @@
           <w:sz w:val="22"/>
           <w:szCs w:val="22"/>
         </w:rPr>
-        <w:t>3</w:t>
-      </w:r>
+      </w:pPr>
       <w:r>
         <w:rPr>
           <w:rFonts w:ascii="Georgia" w:hAnsi="Georgia"/>
@@ -9305,10 +9001,13 @@
           <w:sz w:val="22"/>
           <w:szCs w:val="22"/>
         </w:rPr>
-        <w:t>D paramétrico, libre y de código abierto, distribuido bajo la licencia GNU LGPL 2.1, que permite su uso sin costo en entornos académicos y comerciales (</w:t>
-      </w:r>
-      <w:proofErr w:type="spellStart"/>
-      <w:r>
+        <w:t>El sistema interactúa con los siguientes actores y elementos de su entorno:</w:t>
+      </w:r>
+    </w:p>
+    <w:p>
+      <w:pPr>
+        <w:pStyle w:val="guiazul"/>
+        <w:ind w:left="600"/>
         <w:rPr>
           <w:rFonts w:ascii="Georgia" w:hAnsi="Georgia"/>
           <w:i w:val="0"/>
@@ -9316,10 +9015,12 @@
           <w:sz w:val="22"/>
           <w:szCs w:val="22"/>
         </w:rPr>
-        <w:t>FreeCAD</w:t>
-      </w:r>
-      <w:proofErr w:type="spellEnd"/>
-      <w:r>
+      </w:pPr>
+    </w:p>
+    <w:p>
+      <w:pPr>
+        <w:pStyle w:val="guiazul"/>
+        <w:ind w:left="600"/>
         <w:rPr>
           <w:rFonts w:ascii="Georgia" w:hAnsi="Georgia"/>
           <w:i w:val="0"/>
@@ -9327,9 +9028,7 @@
           <w:sz w:val="22"/>
           <w:szCs w:val="22"/>
         </w:rPr>
-        <w:t xml:space="preserve">, s. f.). La alternativa considerada, SOLIDWORKS Student </w:t>
-      </w:r>
-      <w:proofErr w:type="spellStart"/>
+      </w:pPr>
       <w:r>
         <w:rPr>
           <w:rFonts w:ascii="Georgia" w:hAnsi="Georgia"/>
@@ -9338,10 +9037,13 @@
           <w:sz w:val="22"/>
           <w:szCs w:val="22"/>
         </w:rPr>
-        <w:t>Edition</w:t>
-      </w:r>
-      <w:proofErr w:type="spellEnd"/>
-      <w:r>
+        <w:t>- Usuario: opera el Control giroscópico para enviar las órdenes de conducción y supervisa el estado del Carrito en la pantalla integrada.</w:t>
+      </w:r>
+    </w:p>
+    <w:p>
+      <w:pPr>
+        <w:pStyle w:val="guiazul"/>
+        <w:ind w:left="600"/>
         <w:rPr>
           <w:rFonts w:ascii="Georgia" w:hAnsi="Georgia"/>
           <w:i w:val="0"/>
@@ -9349,10 +9051,12 @@
           <w:sz w:val="22"/>
           <w:szCs w:val="22"/>
         </w:rPr>
-        <w:t xml:space="preserve">, se licencia exclusivamente para uso educativo y no comercial, tiene una vigencia de 12 meses, identifica los archivos y planos generados como pertenecientes a la edición estudiantil y no garantiza que dichos archivos puedan abrirse en las versiones comerciales del software (Dassault </w:t>
-      </w:r>
-      <w:proofErr w:type="spellStart"/>
-      <w:r>
+      </w:pPr>
+    </w:p>
+    <w:p>
+      <w:pPr>
+        <w:pStyle w:val="guiazul"/>
+        <w:ind w:left="600"/>
         <w:rPr>
           <w:rFonts w:ascii="Georgia" w:hAnsi="Georgia"/>
           <w:i w:val="0"/>
@@ -9360,9 +9064,7 @@
           <w:sz w:val="22"/>
           <w:szCs w:val="22"/>
         </w:rPr>
-        <w:t>Systèmes</w:t>
-      </w:r>
-      <w:proofErr w:type="spellEnd"/>
+      </w:pPr>
       <w:r>
         <w:rPr>
           <w:rFonts w:ascii="Georgia" w:hAnsi="Georgia"/>
@@ -9371,10 +9073,13 @@
           <w:sz w:val="22"/>
           <w:szCs w:val="22"/>
         </w:rPr>
-        <w:t xml:space="preserve"> SolidWorks </w:t>
-      </w:r>
-      <w:proofErr w:type="spellStart"/>
-      <w:r>
+        <w:t>- Sistema de posicionamiento global (GPS): suministra las señales de posicionamiento que el Carrito utiliza para determinar su posición y desplazarse en modo autónomo. [TBR: fuente de la orientación del Carrito].</w:t>
+      </w:r>
+    </w:p>
+    <w:p>
+      <w:pPr>
+        <w:pStyle w:val="guiazul"/>
+        <w:ind w:left="600"/>
         <w:rPr>
           <w:rFonts w:ascii="Georgia" w:hAnsi="Georgia"/>
           <w:i w:val="0"/>
@@ -9382,10 +9087,12 @@
           <w:sz w:val="22"/>
           <w:szCs w:val="22"/>
         </w:rPr>
-        <w:t>Corporation</w:t>
-      </w:r>
-      <w:proofErr w:type="spellEnd"/>
-      <w:r>
+      </w:pPr>
+    </w:p>
+    <w:p>
+      <w:pPr>
+        <w:pStyle w:val="guiazul"/>
+        <w:ind w:left="600"/>
         <w:rPr>
           <w:rFonts w:ascii="Georgia" w:hAnsi="Georgia"/>
           <w:i w:val="0"/>
@@ -9393,9 +9100,7 @@
           <w:sz w:val="22"/>
           <w:szCs w:val="22"/>
         </w:rPr>
-        <w:t xml:space="preserve">, s. f.). Estas condiciones limitarían una eventual comercialización del diseño del </w:t>
-      </w:r>
-      <w:proofErr w:type="spellStart"/>
+      </w:pPr>
       <w:r>
         <w:rPr>
           <w:rFonts w:ascii="Georgia" w:hAnsi="Georgia"/>
@@ -9404,9 +9109,13 @@
           <w:sz w:val="22"/>
           <w:szCs w:val="22"/>
         </w:rPr>
-        <w:t>Carrito.</w:t>
-      </w:r>
-      <w:r>
+        <w:t>- Dispositivo Bluetooth: medio de mando complementario para el envío de órdenes al Carrito. [TBD: tipo de dispositivo, versión del protocolo y órdenes disponibles].</w:t>
+      </w:r>
+    </w:p>
+    <w:p>
+      <w:pPr>
+        <w:pStyle w:val="guiazul"/>
+        <w:ind w:left="600"/>
         <w:rPr>
           <w:rFonts w:ascii="Georgia" w:hAnsi="Georgia"/>
           <w:i w:val="0"/>
@@ -9414,10 +9123,12 @@
           <w:sz w:val="22"/>
           <w:szCs w:val="22"/>
         </w:rPr>
-        <w:t>y</w:t>
-      </w:r>
-      <w:proofErr w:type="spellEnd"/>
-      <w:r>
+      </w:pPr>
+    </w:p>
+    <w:p>
+      <w:pPr>
+        <w:pStyle w:val="guiazul"/>
+        <w:ind w:left="600"/>
         <w:rPr>
           <w:rFonts w:ascii="Georgia" w:hAnsi="Georgia"/>
           <w:i w:val="0"/>
@@ -9425,13 +9136,8 @@
           <w:sz w:val="22"/>
           <w:szCs w:val="22"/>
         </w:rPr>
-        <w:t xml:space="preserve"> el diseño de la placa de circuito impreso (PCB) de su sistema electrónico.</w:t>
-      </w:r>
-    </w:p>
-    <w:p>
-      <w:pPr>
-        <w:pStyle w:val="guiazul"/>
-        <w:ind w:left="600"/>
+      </w:pPr>
+      <w:r>
         <w:rPr>
           <w:rFonts w:ascii="Georgia" w:hAnsi="Georgia"/>
           <w:i w:val="0"/>
@@ -9439,7 +9145,8 @@
           <w:sz w:val="22"/>
           <w:szCs w:val="22"/>
         </w:rPr>
-      </w:pPr>
+        <w:t>- Entorno de operación: espacio físico en el que circula el Carrito, incluidas las irregularidades de la superficie, las pendientes del terreno y los obstáculos presentes en la trayectoria.</w:t>
+      </w:r>
     </w:p>
     <w:p>
       <w:pPr>
@@ -9453,7 +9160,11 @@
           <w:szCs w:val="22"/>
         </w:rPr>
       </w:pPr>
-      <w:r>
+    </w:p>
+    <w:p>
+      <w:pPr>
+        <w:pStyle w:val="guiazul"/>
+        <w:ind w:left="600"/>
         <w:rPr>
           <w:rFonts w:ascii="Georgia" w:hAnsi="Georgia"/>
           <w:i w:val="0"/>
@@ -9461,13 +9172,8 @@
           <w:sz w:val="22"/>
           <w:szCs w:val="22"/>
         </w:rPr>
-        <w:t>El sistema interactúa con los siguientes actores y elementos de su entorno:</w:t>
-      </w:r>
-    </w:p>
-    <w:p>
-      <w:pPr>
-        <w:pStyle w:val="guiazul"/>
-        <w:ind w:left="600"/>
+      </w:pPr>
+      <w:r>
         <w:rPr>
           <w:rFonts w:ascii="Georgia" w:hAnsi="Georgia"/>
           <w:i w:val="0"/>
@@ -9475,7 +9181,8 @@
           <w:sz w:val="22"/>
           <w:szCs w:val="22"/>
         </w:rPr>
-      </w:pPr>
+        <w:t>Las interfaces del sistema son las siguientes:</w:t>
+      </w:r>
     </w:p>
     <w:p>
       <w:pPr>
@@ -9489,7 +9196,11 @@
           <w:szCs w:val="22"/>
         </w:rPr>
       </w:pPr>
-      <w:r>
+    </w:p>
+    <w:p>
+      <w:pPr>
+        <w:pStyle w:val="guiazul"/>
+        <w:ind w:left="600"/>
         <w:rPr>
           <w:rFonts w:ascii="Georgia" w:hAnsi="Georgia"/>
           <w:i w:val="0"/>
@@ -9497,13 +9208,8 @@
           <w:sz w:val="22"/>
           <w:szCs w:val="22"/>
         </w:rPr>
-        <w:t>- Usuario: opera el Control giroscópico para enviar las órdenes de conducción y supervisa el estado del Carrito en la pantalla integrada.</w:t>
-      </w:r>
-    </w:p>
-    <w:p>
-      <w:pPr>
-        <w:pStyle w:val="guiazul"/>
-        <w:ind w:left="600"/>
+      </w:pPr>
+      <w:r>
         <w:rPr>
           <w:rFonts w:ascii="Georgia" w:hAnsi="Georgia"/>
           <w:i w:val="0"/>
@@ -9511,7 +9217,8 @@
           <w:sz w:val="22"/>
           <w:szCs w:val="22"/>
         </w:rPr>
-      </w:pPr>
+        <w:t>- I-01 (Control giroscópico &lt;-&gt; Carrito): enlace de radiofrecuencia para la transmisión bidireccional de las órdenes de control y de la telemetría (nivel de carga de la batería y orientación). [TBD: banda de operación].</w:t>
+      </w:r>
     </w:p>
     <w:p>
       <w:pPr>
@@ -9525,7 +9232,11 @@
           <w:szCs w:val="22"/>
         </w:rPr>
       </w:pPr>
-      <w:r>
+    </w:p>
+    <w:p>
+      <w:pPr>
+        <w:pStyle w:val="guiazul"/>
+        <w:ind w:left="600"/>
         <w:rPr>
           <w:rFonts w:ascii="Georgia" w:hAnsi="Georgia"/>
           <w:i w:val="0"/>
@@ -9533,13 +9244,8 @@
           <w:sz w:val="22"/>
           <w:szCs w:val="22"/>
         </w:rPr>
-        <w:t>- Sistema de posicionamiento global (GPS): suministra las señales de posicionamiento que el Carrito utiliza para determinar su posición y desplazarse en modo autónomo. [TBR: fuente de la orientación del Carrito].</w:t>
-      </w:r>
-    </w:p>
-    <w:p>
-      <w:pPr>
-        <w:pStyle w:val="guiazul"/>
-        <w:ind w:left="600"/>
+      </w:pPr>
+      <w:r>
         <w:rPr>
           <w:rFonts w:ascii="Georgia" w:hAnsi="Georgia"/>
           <w:i w:val="0"/>
@@ -9547,7 +9253,8 @@
           <w:sz w:val="22"/>
           <w:szCs w:val="22"/>
         </w:rPr>
-      </w:pPr>
+        <w:t>- I-02 (Dispositivo Bluetooth -&gt; Carrito): enlace inalámbrico secundario para la recepción de órdenes de mando. [TBD: versión y órdenes].</w:t>
+      </w:r>
     </w:p>
     <w:p>
       <w:pPr>
@@ -9561,7 +9268,11 @@
           <w:szCs w:val="22"/>
         </w:rPr>
       </w:pPr>
-      <w:r>
+    </w:p>
+    <w:p>
+      <w:pPr>
+        <w:pStyle w:val="guiazul"/>
+        <w:ind w:left="600"/>
         <w:rPr>
           <w:rFonts w:ascii="Georgia" w:hAnsi="Georgia"/>
           <w:i w:val="0"/>
@@ -9569,13 +9280,8 @@
           <w:sz w:val="22"/>
           <w:szCs w:val="22"/>
         </w:rPr>
-        <w:t>- Dispositivo Bluetooth: medio de mando complementario para el envío de órdenes al Carrito. [TBD: tipo de dispositivo, versión del protocolo y órdenes disponibles].</w:t>
-      </w:r>
-    </w:p>
-    <w:p>
-      <w:pPr>
-        <w:pStyle w:val="guiazul"/>
-        <w:ind w:left="600"/>
+      </w:pPr>
+      <w:r>
         <w:rPr>
           <w:rFonts w:ascii="Georgia" w:hAnsi="Georgia"/>
           <w:i w:val="0"/>
@@ -9583,7 +9289,8 @@
           <w:sz w:val="22"/>
           <w:szCs w:val="22"/>
         </w:rPr>
-      </w:pPr>
+        <w:t>- I-03 (Satélites GPS -&gt; Carrito): recepción unidireccional de las señales de posicionamiento para la navegación autónoma.</w:t>
+      </w:r>
     </w:p>
     <w:p>
       <w:pPr>
@@ -9597,7 +9304,11 @@
           <w:szCs w:val="22"/>
         </w:rPr>
       </w:pPr>
-      <w:r>
+    </w:p>
+    <w:p>
+      <w:pPr>
+        <w:pStyle w:val="guiazul"/>
+        <w:ind w:left="600"/>
         <w:rPr>
           <w:rFonts w:ascii="Georgia" w:hAnsi="Georgia"/>
           <w:i w:val="0"/>
@@ -9605,13 +9316,8 @@
           <w:sz w:val="22"/>
           <w:szCs w:val="22"/>
         </w:rPr>
-        <w:t>- Entorno de operación: espacio físico en el que circula el Carrito, incluidas las irregularidades de la superficie, las pendientes del terreno y los obstáculos presentes en la trayectoria.</w:t>
-      </w:r>
-    </w:p>
-    <w:p>
-      <w:pPr>
-        <w:pStyle w:val="guiazul"/>
-        <w:ind w:left="600"/>
+      </w:pPr>
+      <w:r>
         <w:rPr>
           <w:rFonts w:ascii="Georgia" w:hAnsi="Georgia"/>
           <w:i w:val="0"/>
@@ -9619,7 +9325,8 @@
           <w:sz w:val="22"/>
           <w:szCs w:val="22"/>
         </w:rPr>
-      </w:pPr>
+        <w:t>- I-04 (Usuario &lt;-&gt; Control giroscópico): interfaz física y visual que comprende las palancas, la inclinación del control, el botón de modo y la lectura de datos en la pantalla. [TBD: funciones adicionales del botón de modo].</w:t>
+      </w:r>
     </w:p>
     <w:p>
       <w:pPr>
@@ -9633,7 +9340,11 @@
           <w:szCs w:val="22"/>
         </w:rPr>
       </w:pPr>
-      <w:r>
+    </w:p>
+    <w:p>
+      <w:pPr>
+        <w:pStyle w:val="guiazul"/>
+        <w:ind w:left="600"/>
         <w:rPr>
           <w:rFonts w:ascii="Georgia" w:hAnsi="Georgia"/>
           <w:i w:val="0"/>
@@ -9641,13 +9352,8 @@
           <w:sz w:val="22"/>
           <w:szCs w:val="22"/>
         </w:rPr>
-        <w:t>Las interfaces del sistema son las siguientes:</w:t>
-      </w:r>
-    </w:p>
-    <w:p>
-      <w:pPr>
-        <w:pStyle w:val="guiazul"/>
-        <w:ind w:left="600"/>
+      </w:pPr>
+      <w:r>
         <w:rPr>
           <w:rFonts w:ascii="Georgia" w:hAnsi="Georgia"/>
           <w:i w:val="0"/>
@@ -9655,7 +9361,8 @@
           <w:sz w:val="22"/>
           <w:szCs w:val="22"/>
         </w:rPr>
-      </w:pPr>
+        <w:t>- I-05 (Entorno de operación -&gt; Carrito): lectura del entorno físico mediante sensores embarcados para la detección de obstáculos y de la pendiente del terreno.</w:t>
+      </w:r>
     </w:p>
     <w:p>
       <w:pPr>
@@ -9669,7 +9376,11 @@
           <w:szCs w:val="22"/>
         </w:rPr>
       </w:pPr>
-      <w:r>
+    </w:p>
+    <w:p>
+      <w:pPr>
+        <w:pStyle w:val="guiazul"/>
+        <w:ind w:left="600"/>
         <w:rPr>
           <w:rFonts w:ascii="Georgia" w:hAnsi="Georgia"/>
           <w:i w:val="0"/>
@@ -9677,13 +9388,8 @@
           <w:sz w:val="22"/>
           <w:szCs w:val="22"/>
         </w:rPr>
-        <w:t>- I-01 (Control giroscópico &lt;-&gt; Carrito): enlace de radiofrecuencia para la transmisión bidireccional de las órdenes de control y de la telemetría (nivel de carga de la batería y orientación). [TBD: banda de operación].</w:t>
-      </w:r>
-    </w:p>
-    <w:p>
-      <w:pPr>
-        <w:pStyle w:val="guiazul"/>
-        <w:ind w:left="600"/>
+      </w:pPr>
+      <w:r>
         <w:rPr>
           <w:rFonts w:ascii="Georgia" w:hAnsi="Georgia"/>
           <w:i w:val="0"/>
@@ -9691,7 +9397,8 @@
           <w:sz w:val="22"/>
           <w:szCs w:val="22"/>
         </w:rPr>
-      </w:pPr>
+        <w:t>La interfaz I-01 es interna, ya que comunica los dos elementos del producto; las interfaces I-02 a I-05 gestionan el intercambio con entidades externas.</w:t>
+      </w:r>
     </w:p>
     <w:p>
       <w:pPr>
@@ -9705,7 +9412,11 @@
           <w:szCs w:val="22"/>
         </w:rPr>
       </w:pPr>
-      <w:r>
+    </w:p>
+    <w:p>
+      <w:pPr>
+        <w:pStyle w:val="guiazul"/>
+        <w:ind w:left="600"/>
         <w:rPr>
           <w:rFonts w:ascii="Georgia" w:hAnsi="Georgia"/>
           <w:i w:val="0"/>
@@ -9713,13 +9424,8 @@
           <w:sz w:val="22"/>
           <w:szCs w:val="22"/>
         </w:rPr>
-        <w:t>- I-02 (Dispositivo Bluetooth -&gt; Carrito): enlace inalámbrico secundario para la recepción de órdenes de mando. [TBD: versión y órdenes].</w:t>
-      </w:r>
-    </w:p>
-    <w:p>
-      <w:pPr>
-        <w:pStyle w:val="guiazul"/>
-        <w:ind w:left="600"/>
+      </w:pPr>
+      <w:r>
         <w:rPr>
           <w:rFonts w:ascii="Georgia" w:hAnsi="Georgia"/>
           <w:i w:val="0"/>
@@ -9727,211 +9433,33 @@
           <w:sz w:val="22"/>
           <w:szCs w:val="22"/>
         </w:rPr>
-      </w:pPr>
+        <w:t>La Figura 2.1 presenta la frontera del sistema, sus elementos internos y su interacción con los actores externos descritos.</w:t>
+      </w:r>
     </w:p>
     <w:p>
       <w:pPr>
         <w:pStyle w:val="guiazul"/>
         <w:ind w:left="600"/>
         <w:rPr>
-          <w:rFonts w:ascii="Georgia" w:hAnsi="Georgia"/>
           <w:i w:val="0"/>
           <w:color w:val="auto"/>
-          <w:sz w:val="22"/>
-          <w:szCs w:val="22"/>
-        </w:rPr>
-      </w:pPr>
-      <w:r>
-        <w:rPr>
-          <w:rFonts w:ascii="Georgia" w:hAnsi="Georgia"/>
+        </w:rPr>
+      </w:pPr>
+    </w:p>
+    <w:p>
+      <w:pPr>
+        <w:pStyle w:val="guiazul"/>
+        <w:ind w:left="600"/>
+      </w:pPr>
+      <w:r>
+        <w:rPr>
           <w:i w:val="0"/>
           <w:color w:val="auto"/>
-          <w:sz w:val="22"/>
-          <w:szCs w:val="22"/>
-        </w:rPr>
-        <w:t>- I-03 (Satélites GPS -&gt; Carrito): recepción unidireccional de las señales de posicionamiento para la navegación autónoma.</w:t>
-      </w:r>
-    </w:p>
-    <w:p>
-      <w:pPr>
-        <w:pStyle w:val="guiazul"/>
-        <w:ind w:left="600"/>
-        <w:rPr>
-          <w:rFonts w:ascii="Georgia" w:hAnsi="Georgia"/>
-          <w:i w:val="0"/>
-          <w:color w:val="auto"/>
-          <w:sz w:val="22"/>
-          <w:szCs w:val="22"/>
-        </w:rPr>
-      </w:pPr>
-    </w:p>
-    <w:p>
-      <w:pPr>
-        <w:pStyle w:val="guiazul"/>
-        <w:ind w:left="600"/>
-        <w:rPr>
-          <w:rFonts w:ascii="Georgia" w:hAnsi="Georgia"/>
-          <w:i w:val="0"/>
-          <w:color w:val="auto"/>
-          <w:sz w:val="22"/>
-          <w:szCs w:val="22"/>
-        </w:rPr>
-      </w:pPr>
-      <w:r>
-        <w:rPr>
-          <w:rFonts w:ascii="Georgia" w:hAnsi="Georgia"/>
-          <w:i w:val="0"/>
-          <w:color w:val="auto"/>
-          <w:sz w:val="22"/>
-          <w:szCs w:val="22"/>
-        </w:rPr>
-        <w:t>- I-04 (Usuario &lt;-&gt; Control giroscópico): interfaz física y visual que comprende las palancas, la inclinación del control, el botón de modo y la lectura de datos en la pantalla. [TBD: funciones adicionales del botón de modo].</w:t>
-      </w:r>
-    </w:p>
-    <w:p>
-      <w:pPr>
-        <w:pStyle w:val="guiazul"/>
-        <w:ind w:left="600"/>
-        <w:rPr>
-          <w:rFonts w:ascii="Georgia" w:hAnsi="Georgia"/>
-          <w:i w:val="0"/>
-          <w:color w:val="auto"/>
-          <w:sz w:val="22"/>
-          <w:szCs w:val="22"/>
-        </w:rPr>
-      </w:pPr>
-    </w:p>
-    <w:p>
-      <w:pPr>
-        <w:pStyle w:val="guiazul"/>
-        <w:ind w:left="600"/>
-        <w:rPr>
-          <w:rFonts w:ascii="Georgia" w:hAnsi="Georgia"/>
-          <w:i w:val="0"/>
-          <w:color w:val="auto"/>
-          <w:sz w:val="22"/>
-          <w:szCs w:val="22"/>
-        </w:rPr>
-      </w:pPr>
-      <w:r>
-        <w:rPr>
-          <w:rFonts w:ascii="Georgia" w:hAnsi="Georgia"/>
-          <w:i w:val="0"/>
-          <w:color w:val="auto"/>
-          <w:sz w:val="22"/>
-          <w:szCs w:val="22"/>
-        </w:rPr>
-        <w:t>- I-05 (Entorno de operación -&gt; Carrito): lectura del entorno físico mediante sensores embarcados para la detección de obstáculos y de la pendiente del terreno.</w:t>
-      </w:r>
-    </w:p>
-    <w:p>
-      <w:pPr>
-        <w:pStyle w:val="guiazul"/>
-        <w:ind w:left="600"/>
-        <w:rPr>
-          <w:rFonts w:ascii="Georgia" w:hAnsi="Georgia"/>
-          <w:i w:val="0"/>
-          <w:color w:val="auto"/>
-          <w:sz w:val="22"/>
-          <w:szCs w:val="22"/>
-        </w:rPr>
-      </w:pPr>
-    </w:p>
-    <w:p>
-      <w:pPr>
-        <w:pStyle w:val="guiazul"/>
-        <w:ind w:left="600"/>
-        <w:rPr>
-          <w:rFonts w:ascii="Georgia" w:hAnsi="Georgia"/>
-          <w:i w:val="0"/>
-          <w:color w:val="auto"/>
-          <w:sz w:val="22"/>
-          <w:szCs w:val="22"/>
-        </w:rPr>
-      </w:pPr>
-      <w:r>
-        <w:rPr>
-          <w:rFonts w:ascii="Georgia" w:hAnsi="Georgia"/>
-          <w:i w:val="0"/>
-          <w:color w:val="auto"/>
-          <w:sz w:val="22"/>
-          <w:szCs w:val="22"/>
-        </w:rPr>
-        <w:t>La interfaz I-01 es interna, ya que comunica los dos elementos del producto; las interfaces I-02 a I-05 gestionan el intercambio con entidades externas.</w:t>
-      </w:r>
-    </w:p>
-    <w:p>
-      <w:pPr>
-        <w:pStyle w:val="guiazul"/>
-        <w:ind w:left="600"/>
-        <w:rPr>
-          <w:rFonts w:ascii="Georgia" w:hAnsi="Georgia"/>
-          <w:i w:val="0"/>
-          <w:color w:val="auto"/>
-          <w:sz w:val="22"/>
-          <w:szCs w:val="22"/>
-        </w:rPr>
-      </w:pPr>
-    </w:p>
-    <w:p>
-      <w:pPr>
-        <w:pStyle w:val="guiazul"/>
-        <w:ind w:left="600"/>
-        <w:rPr>
-          <w:rFonts w:ascii="Georgia" w:hAnsi="Georgia"/>
-          <w:i w:val="0"/>
-          <w:color w:val="auto"/>
-          <w:sz w:val="22"/>
-          <w:szCs w:val="22"/>
-        </w:rPr>
-      </w:pPr>
-      <w:r>
-        <w:rPr>
-          <w:rFonts w:ascii="Georgia" w:hAnsi="Georgia"/>
-          <w:i w:val="0"/>
-          <w:color w:val="auto"/>
-          <w:sz w:val="22"/>
-          <w:szCs w:val="22"/>
-        </w:rPr>
-        <w:t>La Figura 2.1 presenta la frontera del sistema, sus elementos internos y su interacción con los actores externos descritos.</w:t>
-      </w:r>
-    </w:p>
-    <w:p>
-      <w:pPr>
-        <w:pStyle w:val="guiazul"/>
-        <w:ind w:left="600"/>
-        <w:rPr>
-          <w:i w:val="0"/>
-          <w:color w:val="auto"/>
-        </w:rPr>
-      </w:pPr>
-    </w:p>
-    <w:p>
-      <w:pPr>
-        <w:pStyle w:val="guiazul"/>
-        <w:ind w:left="600"/>
-      </w:pPr>
-      <w:r>
-        <w:rPr>
-          <w:i w:val="0"/>
-          <w:color w:val="auto"/>
-        </w:rPr>
-        <w:t xml:space="preserve">Figura 2.1. Diagrama de contexto del Sistema Carrito </w:t>
-      </w:r>
-      <w:proofErr w:type="spellStart"/>
-      <w:r>
-        <w:rPr>
-          <w:i w:val="0"/>
-          <w:color w:val="auto"/>
-        </w:rPr>
-        <w:t>RC.</w:t>
-      </w:r>
-      <w:r>
-        <w:t>Indicar</w:t>
-      </w:r>
-      <w:proofErr w:type="spellEnd"/>
-      <w:r>
-        <w:t xml:space="preserve"> si es un producto independiente o parte de un sistema mayor. En el caso de tratarse de un producto que forma parte de un sistema mayor, un diagrama que sitúe el producto dentro del sistema e identifique sus conexiones  facilita la comprensión.</w:t>
+        </w:rPr>
+        <w:t>Figura 2.1. Diagrama de contexto del Sistema Carrito RC.</w:t>
+      </w:r>
+      <w:r>
+        <w:t>Indicar si es un producto independiente o parte de un sistema mayor. En el caso de tratarse de un producto que forma parte de un sistema mayor, un diagrama que sitúe el producto dentro del sistema e identifique sus conexiones  facilita la comprensión.</w:t>
       </w:r>
     </w:p>
     <w:p>
@@ -10431,6 +9959,41 @@
           <w:szCs w:val="28"/>
         </w:rPr>
         <w:t>- F-13. Protección eléctrica de los circuitos del Carrito.</w:t>
+      </w:r>
+    </w:p>
+    <w:p>
+      <w:pPr>
+        <w:pStyle w:val="Normalindentado2"/>
+      </w:pPr>
+      <w:r>
+        <w:t xml:space="preserve"> </w:t>
+      </w:r>
+    </w:p>
+    <w:p>
+      <w:pPr>
+        <w:pStyle w:val="Normalindentado2"/>
+      </w:pPr>
+      <w:r>
+        <w:t>Señalización</w:t>
+      </w:r>
+    </w:p>
+    <w:p>
+      <w:pPr>
+        <w:pStyle w:val="Normalindentado2"/>
+      </w:pPr>
+      <w:r>
+        <w:t xml:space="preserve"> </w:t>
+      </w:r>
+    </w:p>
+    <w:p>
+      <w:pPr>
+        <w:pStyle w:val="Normalindentado2"/>
+      </w:pPr>
+      <w:r>
+        <w:t xml:space="preserve">- </w:t>
+      </w:r>
+      <w:r>
+        <w:t>F-14. Indicación luminosa de la velocidad mediante una tira LED montada en el alerón trasero. La tira permanece apagada con el Carrito detenido; al acelerar, los LED se encienden desde el centro hacia los extremos en proporción a la velocidad, hasta encenderse todos a la velocidad máxima; al frenar, se apagan gradualmente desde los extremos hacia el centro hasta quedar apagada cuando el Carrito se detiene. [TBD: número de LED de la tira y velocidad que corresponde a la tira completa].</w:t>
       </w:r>
     </w:p>
     <w:p>
@@ -10509,12 +10072,6 @@
         <w:gridCol w:w="5444"/>
       </w:tblGrid>
       <w:tr>
-        <w:tblPrEx>
-          <w:tblCellMar>
-            <w:top w:w="0" w:type="dxa"/>
-            <w:bottom w:w="0" w:type="dxa"/>
-          </w:tblCellMar>
-        </w:tblPrEx>
         <w:tc>
           <w:tcPr>
             <w:tcW w:w="2517" w:type="dxa"/>
@@ -10587,12 +10144,6 @@
         </w:tc>
       </w:tr>
       <w:tr>
-        <w:tblPrEx>
-          <w:tblCellMar>
-            <w:top w:w="0" w:type="dxa"/>
-            <w:bottom w:w="0" w:type="dxa"/>
-          </w:tblCellMar>
-        </w:tblPrEx>
         <w:tc>
           <w:tcPr>
             <w:tcW w:w="2517" w:type="dxa"/>
@@ -10663,12 +10214,6 @@
         </w:tc>
       </w:tr>
       <w:tr>
-        <w:tblPrEx>
-          <w:tblCellMar>
-            <w:top w:w="0" w:type="dxa"/>
-            <w:bottom w:w="0" w:type="dxa"/>
-          </w:tblCellMar>
-        </w:tblPrEx>
         <w:tc>
           <w:tcPr>
             <w:tcW w:w="2517" w:type="dxa"/>
@@ -10739,12 +10284,6 @@
         </w:tc>
       </w:tr>
       <w:tr>
-        <w:tblPrEx>
-          <w:tblCellMar>
-            <w:top w:w="0" w:type="dxa"/>
-            <w:bottom w:w="0" w:type="dxa"/>
-          </w:tblCellMar>
-        </w:tblPrEx>
         <w:tc>
           <w:tcPr>
             <w:tcW w:w="2517" w:type="dxa"/>
@@ -11094,12 +10633,6 @@
         <w:gridCol w:w="1884"/>
       </w:tblGrid>
       <w:tr>
-        <w:tblPrEx>
-          <w:tblCellMar>
-            <w:top w:w="0" w:type="dxa"/>
-            <w:bottom w:w="0" w:type="dxa"/>
-          </w:tblCellMar>
-        </w:tblPrEx>
         <w:tc>
           <w:tcPr>
             <w:tcW w:w="2490" w:type="dxa"/>
@@ -11182,12 +10715,6 @@
         </w:tc>
       </w:tr>
       <w:tr>
-        <w:tblPrEx>
-          <w:tblCellMar>
-            <w:top w:w="0" w:type="dxa"/>
-            <w:bottom w:w="0" w:type="dxa"/>
-          </w:tblCellMar>
-        </w:tblPrEx>
         <w:tc>
           <w:tcPr>
             <w:tcW w:w="2490" w:type="dxa"/>
@@ -11261,12 +10788,6 @@
         </w:tc>
       </w:tr>
       <w:tr>
-        <w:tblPrEx>
-          <w:tblCellMar>
-            <w:top w:w="0" w:type="dxa"/>
-            <w:bottom w:w="0" w:type="dxa"/>
-          </w:tblCellMar>
-        </w:tblPrEx>
         <w:tc>
           <w:tcPr>
             <w:tcW w:w="2490" w:type="dxa"/>
@@ -11334,6 +10855,9 @@
               <w:instrText xml:space="preserve"> FORMCHECKBOX </w:instrText>
             </w:r>
             <w:r>
+              <w:fldChar w:fldCharType="separate"/>
+            </w:r>
+            <w:r>
               <w:fldChar w:fldCharType="end"/>
             </w:r>
             <w:bookmarkEnd w:id="38"/>
@@ -11373,6 +10897,9 @@
               <w:instrText xml:space="preserve"> FORMCHECKBOX </w:instrText>
             </w:r>
             <w:r>
+              <w:fldChar w:fldCharType="separate"/>
+            </w:r>
+            <w:r>
               <w:fldChar w:fldCharType="end"/>
             </w:r>
             <w:bookmarkEnd w:id="39"/>
@@ -11383,12 +10910,6 @@
         </w:tc>
       </w:tr>
       <w:tr>
-        <w:tblPrEx>
-          <w:tblCellMar>
-            <w:top w:w="0" w:type="dxa"/>
-            <w:bottom w:w="0" w:type="dxa"/>
-          </w:tblCellMar>
-        </w:tblPrEx>
         <w:tc>
           <w:tcPr>
             <w:tcW w:w="2490" w:type="dxa"/>
@@ -11463,12 +10984,6 @@
         </w:tc>
       </w:tr>
       <w:tr>
-        <w:tblPrEx>
-          <w:tblCellMar>
-            <w:top w:w="0" w:type="dxa"/>
-            <w:bottom w:w="0" w:type="dxa"/>
-          </w:tblCellMar>
-        </w:tblPrEx>
         <w:tc>
           <w:tcPr>
             <w:tcW w:w="2490" w:type="dxa"/>
@@ -11537,6 +11052,9 @@
               <w:instrText xml:space="preserve"> FORMCHECKBOX </w:instrText>
             </w:r>
             <w:r>
+              <w:fldChar w:fldCharType="separate"/>
+            </w:r>
+            <w:r>
               <w:fldChar w:fldCharType="end"/>
             </w:r>
             <w:bookmarkEnd w:id="40"/>
@@ -11576,6 +11094,9 @@
               <w:instrText xml:space="preserve"> FORMCHECKBOX </w:instrText>
             </w:r>
             <w:r>
+              <w:fldChar w:fldCharType="separate"/>
+            </w:r>
+            <w:r>
               <w:fldChar w:fldCharType="end"/>
             </w:r>
             <w:bookmarkEnd w:id="41"/>
@@ -11615,6 +11136,9 @@
               <w:instrText xml:space="preserve"> FORMCHECKBOX </w:instrText>
             </w:r>
             <w:r>
+              <w:fldChar w:fldCharType="separate"/>
+            </w:r>
+            <w:r>
               <w:fldChar w:fldCharType="end"/>
             </w:r>
             <w:bookmarkEnd w:id="42"/>
@@ -12073,15 +11597,7 @@
         <w:ind w:left="600"/>
       </w:pPr>
       <w:r>
-        <w:t xml:space="preserve">Las requisitos funcionales pueden ser divididos en </w:t>
-      </w:r>
-      <w:proofErr w:type="spellStart"/>
-      <w:r>
-        <w:t>sub-secciones</w:t>
-      </w:r>
-      <w:proofErr w:type="spellEnd"/>
-      <w:r>
-        <w:t>.</w:t>
+        <w:t>Las requisitos funcionales pueden ser divididos en sub-secciones.</w:t>
       </w:r>
     </w:p>
     <w:p>
@@ -12718,12 +12234,6 @@
       <w:gridCol w:w="6537"/>
     </w:tblGrid>
     <w:tr>
-      <w:tblPrEx>
-        <w:tblCellMar>
-          <w:top w:w="0" w:type="dxa"/>
-          <w:bottom w:w="0" w:type="dxa"/>
-        </w:tblCellMar>
-      </w:tblPrEx>
       <w:tc>
         <w:tcPr>
           <w:tcW w:w="1947" w:type="dxa"/>
@@ -12785,18 +12295,8 @@
               <w:color w:val="241A61"/>
               <w:sz w:val="16"/>
             </w:rPr>
-            <w:t xml:space="preserve">Descripción de requisitos del </w:t>
+            <w:t>Descripción de requisitos del sofware</w:t>
           </w:r>
-          <w:proofErr w:type="spellStart"/>
-          <w:r>
-            <w:rPr>
-              <w:rFonts w:cs="Arial"/>
-              <w:color w:val="241A61"/>
-              <w:sz w:val="16"/>
-            </w:rPr>
-            <w:t>sofware</w:t>
-          </w:r>
-          <w:proofErr w:type="spellEnd"/>
         </w:p>
       </w:tc>
     </w:tr>
@@ -12863,17 +12363,11 @@
       <w:tblLook w:val="0000" w:firstRow="0" w:lastRow="0" w:firstColumn="0" w:lastColumn="0" w:noHBand="0" w:noVBand="0"/>
     </w:tblPr>
     <w:tblGrid>
-      <w:gridCol w:w="1947"/>
-      <w:gridCol w:w="5514"/>
-      <w:gridCol w:w="1183"/>
+      <w:gridCol w:w="1952"/>
+      <w:gridCol w:w="5510"/>
+      <w:gridCol w:w="1182"/>
     </w:tblGrid>
     <w:tr>
-      <w:tblPrEx>
-        <w:tblCellMar>
-          <w:top w:w="0" w:type="dxa"/>
-          <w:bottom w:w="0" w:type="dxa"/>
-        </w:tblCellMar>
-      </w:tblPrEx>
       <w:tc>
         <w:tcPr>
           <w:tcW w:w="1274" w:type="dxa"/>
@@ -13102,12 +12596,6 @@
       <w:gridCol w:w="1554"/>
     </w:tblGrid>
     <w:tr>
-      <w:tblPrEx>
-        <w:tblCellMar>
-          <w:top w:w="0" w:type="dxa"/>
-          <w:bottom w:w="0" w:type="dxa"/>
-        </w:tblCellMar>
-      </w:tblPrEx>
       <w:tc>
         <w:tcPr>
           <w:tcW w:w="1947" w:type="dxa"/>
@@ -13386,17 +12874,11 @@
       <w:tblLook w:val="0000" w:firstRow="0" w:lastRow="0" w:firstColumn="0" w:lastColumn="0" w:noHBand="0" w:noVBand="0"/>
     </w:tblPr>
     <w:tblGrid>
-      <w:gridCol w:w="1947"/>
-      <w:gridCol w:w="5143"/>
-      <w:gridCol w:w="1554"/>
+      <w:gridCol w:w="1952"/>
+      <w:gridCol w:w="5139"/>
+      <w:gridCol w:w="1553"/>
     </w:tblGrid>
     <w:tr>
-      <w:tblPrEx>
-        <w:tblCellMar>
-          <w:top w:w="0" w:type="dxa"/>
-          <w:bottom w:w="0" w:type="dxa"/>
-        </w:tblCellMar>
-      </w:tblPrEx>
       <w:tc>
         <w:tcPr>
           <w:tcW w:w="1947" w:type="dxa"/>
@@ -15373,11 +14855,15 @@
   </w:style>
   <w:style w:type="character" w:default="1" w:styleId="Fuentedeprrafopredeter">
     <w:name w:val="Default Paragraph Font"/>
+    <w:uiPriority w:val="1"/>
     <w:semiHidden/>
+    <w:unhideWhenUsed/>
   </w:style>
   <w:style w:type="table" w:default="1" w:styleId="Tablanormal">
     <w:name w:val="Normal Table"/>
+    <w:uiPriority w:val="99"/>
     <w:semiHidden/>
+    <w:unhideWhenUsed/>
     <w:tblPr>
       <w:tblInd w:w="0" w:type="dxa"/>
       <w:tblCellMar>
@@ -15390,7 +14876,9 @@
   </w:style>
   <w:style w:type="numbering" w:default="1" w:styleId="Sinlista">
     <w:name w:val="No List"/>
+    <w:uiPriority w:val="99"/>
     <w:semiHidden/>
+    <w:unhideWhenUsed/>
   </w:style>
   <w:style w:type="paragraph" w:customStyle="1" w:styleId="Normalindentado1">
     <w:name w:val="Normal indentado 1"/>

</xml_diff>